<commit_message>
feat: tracker template generated from Catchr's own sheet code; Jane Doe resume
capture-catchr-sheet.js runs the extension's formatNewSheet/formatDashboardSheet
offline and records the Sheets requests; build-tracker-template.py turns them
into the .xlsx (Jobs + Dashboard). Resume rewritten with fictional details and
researched best practices.

Co-Authored-By: Claude Opus 5.5 <noreply@anthropic.com>
</commit_message>
<xml_diff>
--- a/downloads/catchr-resume-template.docx
+++ b/downloads/catchr-resume-template.docx
@@ -11,7 +11,7 @@
           <w:b/>
           <w:sz w:val="44"/>
         </w:rPr>
-        <w:t>Alex Morgan</w:t>
+        <w:t>Jane Doe</w:t>
       </w:r>
     </w:p>
     <w:p>
@@ -24,7 +24,7 @@
           <w:color w:val="5E564C"/>
           <w:sz w:val="20"/>
         </w:rPr>
-        <w:t>Austin, TX · alex.morgan@example.com · (555) 010-0147 · linkedin.com/in/alexmorgan</w:t>
+        <w:t>Austin, TX · jane.doe@example.com · (512) 555-0147 · linkedin.com/in/your-profile</w:t>
       </w:r>
     </w:p>
     <w:p>
@@ -55,7 +55,7 @@
         <w:rPr>
           <w:b w:val="0"/>
         </w:rPr>
-        <w:t>Product manager with 6 years of experience shipping B2B software, most recently leading a team of 8 that grew self-serve revenue 40%. Strongest where customer research, data and engineering meet. Replace this with two or three sentences: who you are, your best result, and the kind of role you want next.</w:t>
+        <w:t>Product manager with 7 years in B2B SaaS, most recently owning self-serve growth at an analytics company. Pairs customer research with product data to decide what to build, and what not to. Looking for a senior product role on a growth or platform team.</w:t>
       </w:r>
     </w:p>
     <w:p>
@@ -89,7 +89,7 @@
         <w:rPr>
           <w:b/>
         </w:rPr>
-        <w:t>Senior Product Manager, Brightline Software</w:t>
+        <w:t>Senior Product Manager, Contoso Analytics</w:t>
       </w:r>
       <w:r>
         <w:tab/>
@@ -106,7 +106,7 @@
           <w:color w:val="5E564C"/>
           <w:sz w:val="20"/>
         </w:rPr>
-        <w:t>Austin, TX · Remote-first</w:t>
+        <w:t>Austin, TX · Hybrid</w:t>
       </w:r>
     </w:p>
     <w:p>
@@ -115,7 +115,7 @@
         <w:spacing w:after="40"/>
       </w:pPr>
       <w:r>
-        <w:t>Led the redesign of self-serve onboarding, lifting trial-to-paid conversion from 9% to 14% in two quarters.</w:t>
+        <w:t>Led a redesign of self-serve onboarding with 1 designer and 6 engineers, raising trial-to-paid conversion from 9% to 13% in two quarters.</w:t>
       </w:r>
     </w:p>
     <w:p>
@@ -124,7 +124,7 @@
         <w:spacing w:after="40"/>
       </w:pPr>
       <w:r>
-        <w:t>Built a weekly customer interview program (120+ interviews) that set the roadmap for three product lines.</w:t>
+        <w:t>Cut the roadmap from 14 initiatives to 5 after 60 customer interviews traced churn to reporting gaps, reducing customer churn 18% year over year.</w:t>
       </w:r>
     </w:p>
     <w:p>
@@ -133,7 +133,7 @@
         <w:spacing w:after="40"/>
       </w:pPr>
       <w:r>
-        <w:t>Cut average release cycle from 6 weeks to 2 by introducing feature flags with engineering.</w:t>
+        <w:t>Introduced feature flags and staged rollouts with engineering, shortening the release cycle from 6 weeks to 2.</w:t>
       </w:r>
     </w:p>
     <w:p>
@@ -142,7 +142,7 @@
         <w:spacing w:after="40"/>
       </w:pPr>
       <w:r>
-        <w:t>Start each bullet with a strong verb, include a number, and end with the result it produced.</w:t>
+        <w:t>Defined the product's activation metric with data science; it became the company-wide goal used in quarterly planning.</w:t>
       </w:r>
     </w:p>
     <w:p>
@@ -156,7 +156,7 @@
         <w:rPr>
           <w:b/>
         </w:rPr>
-        <w:t>Product Manager, Fieldnote</w:t>
+        <w:t>Product Manager, Fabrikam Field Services</w:t>
       </w:r>
       <w:r>
         <w:tab/>
@@ -182,7 +182,7 @@
         <w:spacing w:after="40"/>
       </w:pPr>
       <w:r>
-        <w:t>Launched a mobile app used by 30,000 field technicians, reaching a 4.7 App Store rating.</w:t>
+        <w:t>Launched an offline-first mobile app for 30,000 field technicians, reaching a 4.7 App Store rating within six months.</w:t>
       </w:r>
     </w:p>
     <w:p>
@@ -191,7 +191,7 @@
         <w:spacing w:after="40"/>
       </w:pPr>
       <w:r>
-        <w:t>Partnered with sales on pricing research that raised average contract value 18%.</w:t>
+        <w:t>Partnered with sales on packaging and pricing research that raised average contract value 12%.</w:t>
       </w:r>
     </w:p>
     <w:p>
@@ -200,7 +200,7 @@
         <w:spacing w:after="40"/>
       </w:pPr>
       <w:r>
-        <w:t>Wrote specs and acceptance criteria for a team of 6 engineers and 1 designer.</w:t>
+        <w:t>Wrote specs and acceptance criteria for 6 engineers and 1 designer, shipping 3 major releases a year.</w:t>
       </w:r>
     </w:p>
     <w:p>
@@ -214,11 +214,11 @@
         <w:rPr>
           <w:b/>
         </w:rPr>
-        <w:t>Associate Product Manager, Fieldnote</w:t>
+        <w:t>Associate Product Manager, Fabrikam Field Services</w:t>
       </w:r>
       <w:r>
         <w:tab/>
-        <w:t>Jul 2018 to May 2019</w:t>
+        <w:t>Jul 2017 to May 2019</w:t>
       </w:r>
     </w:p>
     <w:p>
@@ -240,7 +240,7 @@
         <w:spacing w:after="40"/>
       </w:pPr>
       <w:r>
-        <w:t>Ran 40+ A/B tests on the signup flow; shipped the 5 winners, adding 2,100 signups a month.</w:t>
+        <w:t>Ran 40 A/B tests on the signup flow and shipped the 5 winners, adding about 2,100 signups a month.</w:t>
       </w:r>
     </w:p>
     <w:p>
@@ -249,7 +249,7 @@
         <w:spacing w:after="40"/>
       </w:pPr>
       <w:r>
-        <w:t>Give every job its own line like the one above, even at the same company, so each one is unique.</w:t>
+        <w:t>Built the team's first SQL funnel dashboard, replacing a manual weekly report.</w:t>
       </w:r>
     </w:p>
     <w:p>
@@ -283,7 +283,7 @@
         <w:t xml:space="preserve">Product: </w:t>
       </w:r>
       <w:r>
-        <w:t>Roadmapping, customer research, A/B testing, pricing, PRDs</w:t>
+        <w:t>Roadmapping, customer discovery, A/B testing, pricing and packaging, PRDs</w:t>
       </w:r>
     </w:p>
     <w:p>
@@ -297,7 +297,7 @@
         <w:t xml:space="preserve">Tools: </w:t>
       </w:r>
       <w:r>
-        <w:t>Jira, Figma, Amplitude, SQL, Looker</w:t>
+        <w:t>Jira, Figma, Amplitude, Mixpanel, SQL, Looker</w:t>
       </w:r>
     </w:p>
     <w:p>
@@ -308,7 +308,7 @@
         <w:rPr>
           <w:b/>
         </w:rPr>
-        <w:t xml:space="preserve">Ways of working: </w:t>
+        <w:t xml:space="preserve">Leadership: </w:t>
       </w:r>
       <w:r>
         <w:t>Cross-functional leadership, stakeholder communication, mentoring</w:t>
@@ -345,11 +345,11 @@
         <w:rPr>
           <w:b/>
         </w:rPr>
-        <w:t>B.S. Business Administration, University of Colorado Boulder</w:t>
+        <w:t>B.S. Business Administration, State University</w:t>
       </w:r>
       <w:r>
         <w:tab/>
-        <w:t>May 2018</w:t>
+        <w:t>May 2017</w:t>
       </w:r>
     </w:p>
     <w:sectPr>

</xml_diff>

<commit_message>
feat: resume page links to the shared Google Doc; location synced to San Francisco
Co-Authored-By: Claude Opus 5.5 <noreply@anthropic.com>
</commit_message>
<xml_diff>
--- a/downloads/catchr-resume-template.docx
+++ b/downloads/catchr-resume-template.docx
@@ -24,7 +24,7 @@
           <w:color w:val="5E564C"/>
           <w:sz w:val="20"/>
         </w:rPr>
-        <w:t>Austin, TX · jane.doe@example.com · (512) 555-0147 · linkedin.com/in/your-profile</w:t>
+        <w:t>San Francisco, CA · jane.doe@example.com · (512) 555-0147 · linkedin.com/in/your-profile</w:t>
       </w:r>
     </w:p>
     <w:p>
@@ -106,7 +106,7 @@
           <w:color w:val="5E564C"/>
           <w:sz w:val="20"/>
         </w:rPr>
-        <w:t>Austin, TX · Hybrid</w:t>
+        <w:t>San Francisco, CA · Hybrid</w:t>
       </w:r>
     </w:p>
     <w:p>

</xml_diff>

<commit_message>
design: resume template in Arial with a centered name and contact line
Arial is installed almost everywhere, so the .docx, the Google Doc and the
site preview all show the same font.

Co-Authored-By: Claude Opus 5.5 <noreply@anthropic.com>
</commit_message>
<xml_diff>
--- a/downloads/catchr-resume-template.docx
+++ b/downloads/catchr-resume-template.docx
@@ -5,6 +5,7 @@
     <w:p>
       <w:pPr>
         <w:spacing w:after="40" w:before="0"/>
+        <w:jc w:val="center"/>
       </w:pPr>
       <w:r>
         <w:rPr>
@@ -17,6 +18,7 @@
     <w:p>
       <w:pPr>
         <w:spacing w:after="80" w:before="0"/>
+        <w:jc w:val="center"/>
       </w:pPr>
       <w:r>
         <w:rPr>
@@ -37,7 +39,7 @@
       </w:pPr>
       <w:r>
         <w:rPr>
-          <w:rFonts w:ascii="Lato" w:hAnsi="Lato"/>
+          <w:rFonts w:ascii="Arial" w:hAnsi="Arial"/>
           <w:b/>
           <w:caps/>
           <w:color w:val="2C5F4A"/>
@@ -68,7 +70,7 @@
       </w:pPr>
       <w:r>
         <w:rPr>
-          <w:rFonts w:ascii="Lato" w:hAnsi="Lato"/>
+          <w:rFonts w:ascii="Arial" w:hAnsi="Arial"/>
           <w:b/>
           <w:caps/>
           <w:color w:val="2C5F4A"/>
@@ -262,7 +264,7 @@
       </w:pPr>
       <w:r>
         <w:rPr>
-          <w:rFonts w:ascii="Lato" w:hAnsi="Lato"/>
+          <w:rFonts w:ascii="Arial" w:hAnsi="Arial"/>
           <w:b/>
           <w:caps/>
           <w:color w:val="2C5F4A"/>
@@ -324,7 +326,7 @@
       </w:pPr>
       <w:r>
         <w:rPr>
-          <w:rFonts w:ascii="Lato" w:hAnsi="Lato"/>
+          <w:rFonts w:ascii="Arial" w:hAnsi="Arial"/>
           <w:b/>
           <w:caps/>
           <w:color w:val="2C5F4A"/>
@@ -729,7 +731,7 @@
       <w:spacing w:after="0" w:line="276" w:lineRule="auto"/>
     </w:pPr>
     <w:rPr>
-      <w:rFonts w:ascii="Lato" w:hAnsi="Lato" w:eastAsia="Lato"/>
+      <w:rFonts w:ascii="Arial" w:hAnsi="Arial" w:eastAsia="Arial"/>
       <w:color w:val="2C2C2A"/>
       <w:sz w:val="21"/>
     </w:rPr>
@@ -1264,7 +1266,7 @@
       <w:contextualSpacing/>
     </w:pPr>
     <w:rPr>
-      <w:rFonts w:ascii="Lato" w:hAnsi="Lato"/>
+      <w:rFonts w:ascii="Arial" w:hAnsi="Arial"/>
     </w:rPr>
   </w:style>
   <w:style w:type="paragraph" w:styleId="ListBullet2">

</xml_diff>